<commit_message>
Expand Paper 3 (lit review, mechanisms, reproducibility); confirm Volta/Cariri/Nethravathi citations; fix Cote d'Ivoire spelling
</commit_message>
<xml_diff>
--- a/paper/qrfactor_paper3.docx
+++ b/paper/qrfactor_paper3.docx
@@ -938,37 +938,97 @@
         <w:t xml:space="preserve"> </w:t>
       </w:r>
       <w:r>
-        <w:t xml:space="preserve">disentangle the processes that control water composition and to classify samples</w:t>
-      </w:r>
-      <w:r>
-        <w:t xml:space="preserve"> </w:t>
-      </w:r>
-      <w:r>
-        <w:t xml:space="preserve">of common origin. In Ghana, multivariate statistical methods including R-mode</w:t>
-      </w:r>
-      <w:r>
-        <w:t xml:space="preserve"> </w:t>
-      </w:r>
-      <w:r>
-        <w:t xml:space="preserve">factor analysis with varimax rotation and the Kaiser criterion have been applied</w:t>
-      </w:r>
-      <w:r>
-        <w:t xml:space="preserve"> </w:t>
-      </w:r>
-      <w:r>
-        <w:t xml:space="preserve">to groundwater in the Volta region to identify the controls on hydrochemistry and</w:t>
-      </w:r>
-      <w:r>
-        <w:t xml:space="preserve"> </w:t>
-      </w:r>
-      <w:r>
-        <w:t xml:space="preserve">their spatial variation across geological terrains (Hydrochemical analysis of</w:t>
-      </w:r>
-      <w:r>
-        <w:t xml:space="preserve"> </w:t>
-      </w:r>
-      <w:r>
-        <w:t xml:space="preserve">groundwater — the Volta region, Ghana,</w:t>
+        <w:t xml:space="preserve">disentangle the processes that control water composition and to classify samples of</w:t>
+      </w:r>
+      <w:r>
+        <w:t xml:space="preserve"> </w:t>
+      </w:r>
+      <w:r>
+        <w:t xml:space="preserve">common origin, and the empirical record is substantial. Reghunath, Murthy and</w:t>
+      </w:r>
+      <w:r>
+        <w:t xml:space="preserve"> </w:t>
+      </w:r>
+      <w:r>
+        <w:t xml:space="preserve">Raghavan (2002) subjected 56 groundwater samples from the Nethravathi catchment</w:t>
+      </w:r>
+      <w:r>
+        <w:t xml:space="preserve"> </w:t>
+      </w:r>
+      <w:r>
+        <w:t xml:space="preserve">(Karnataka, India) to both Q- and R-mode factor and cluster analysis, using R-mode</w:t>
+      </w:r>
+      <w:r>
+        <w:t xml:space="preserve"> </w:t>
+      </w:r>
+      <w:r>
+        <w:t xml:space="preserve">to attribute most of the electrical conductivity and total dissolved solids to a</w:t>
+      </w:r>
+      <w:r>
+        <w:t xml:space="preserve"> </w:t>
+      </w:r>
+      <w:r>
+        <w:t xml:space="preserve">Na–Cl–HCO₃ association and Q-mode to reveal exchange between river water and adjacent</w:t>
+      </w:r>
+      <w:r>
+        <w:t xml:space="preserve"> </w:t>
+      </w:r>
+      <w:r>
+        <w:t xml:space="preserve">groundwater. In Ghana, Banoeng-Yakubo, Yidana and Nti (2009) applied multivariate</w:t>
+      </w:r>
+      <w:r>
+        <w:t xml:space="preserve"> </w:t>
+      </w:r>
+      <w:r>
+        <w:t xml:space="preserve">methods including R-mode factor analysis with varimax rotation and the Kaiser</w:t>
+      </w:r>
+      <w:r>
+        <w:t xml:space="preserve"> </w:t>
+      </w:r>
+      <w:r>
+        <w:t xml:space="preserve">criterion to groundwater in the Volta region, identifying silicate and carbonate</w:t>
+      </w:r>
+      <w:r>
+        <w:t xml:space="preserve"> </w:t>
+      </w:r>
+      <w:r>
+        <w:t xml:space="preserve">weathering as the dominant hydrochemical controls and resolving recharge,</w:t>
+      </w:r>
+      <w:r>
+        <w:t xml:space="preserve"> </w:t>
+      </w:r>
+      <w:r>
+        <w:t xml:space="preserve">intermediate and discharge zones across the Buem, Voltaian and Togo terrains.</w:t>
+      </w:r>
+      <w:r>
+        <w:t xml:space="preserve"> </w:t>
+      </w:r>
+      <w:r>
+        <w:t xml:space="preserve">Machado, Santiago, Frischkorn and Mendes Filho (2008) used Q-mode factor analysis to</w:t>
+      </w:r>
+      <w:r>
+        <w:t xml:space="preserve"> </w:t>
+      </w:r>
+      <w:r>
+        <w:t xml:space="preserve">cluster 56 groundwaters of the Cariri Valley (north-east Brazil) by hydrogeochemical</w:t>
+      </w:r>
+      <w:r>
+        <w:t xml:space="preserve"> </w:t>
+      </w:r>
+      <w:r>
+        <w:t xml:space="preserve">origin. These studies — and many like them across India, West Africa and South</w:t>
+      </w:r>
+      <w:r>
+        <w:t xml:space="preserve"> </w:t>
+      </w:r>
+      <w:r>
+        <w:t xml:space="preserve">America — share a common template: standardise, factor, rotate, retain by Kaiser,</w:t>
+      </w:r>
+      <w:r>
+        <w:t xml:space="preserve"> </w:t>
+      </w:r>
+      <w:r>
+        <w:t xml:space="preserve">interpret. Yet three features recur. They almost always report variable structure</w:t>
       </w:r>
       <w:r>
         <w:t xml:space="preserve"> </w:t>
@@ -978,50 +1038,125 @@
           <w:iCs/>
           <w:i/>
         </w:rPr>
-        <w:t xml:space="preserve">KSCE Journal of Civil Engineering</w:t>
-      </w:r>
-      <w:r>
-        <w:t xml:space="preserve">, 2009).</w:t>
-      </w:r>
-      <w:r>
-        <w:t xml:space="preserve"> </w:t>
-      </w:r>
-      <w:r>
-        <w:t xml:space="preserve">Q-mode factor analysis has been used to cluster groundwaters by hydrogeochemical</w:t>
-      </w:r>
-      <w:r>
-        <w:t xml:space="preserve"> </w:t>
-      </w:r>
-      <w:r>
-        <w:t xml:space="preserve">origin in the Cariri Valley of northern Brazil (</w:t>
+        <w:t xml:space="preserve">or</w:t>
+      </w:r>
+      <w:r>
+        <w:t xml:space="preserve"> </w:t>
+      </w:r>
+      <w:r>
+        <w:t xml:space="preserve">sample grouping, rarely both on shared axes. They operate at the</w:t>
+      </w:r>
+      <w:r>
+        <w:t xml:space="preserve"> </w:t>
+      </w:r>
+      <w:r>
+        <w:t xml:space="preserve">sample-within-catchment scale, seldom at the inter-regional scale at which water</w:t>
+      </w:r>
+      <w:r>
+        <w:t xml:space="preserve"> </w:t>
+      </w:r>
+      <w:r>
+        <w:t xml:space="preserve">policy is set. And they rarely write the result back to a map or make the pipeline</w:t>
+      </w:r>
+      <w:r>
+        <w:t xml:space="preserve"> </w:t>
+      </w:r>
+      <w:r>
+        <w:t xml:space="preserve">reproducible end-to-end. The present study is a deliberate contrast on all three</w:t>
+      </w:r>
+      <w:r>
+        <w:t xml:space="preserve"> </w:t>
+      </w:r>
+      <w:r>
+        <w:t xml:space="preserve">counts: shared-axis Q+R, at the inter-country scale, mapped and reproducible.</w:t>
+      </w:r>
+    </w:p>
+    <w:p>
+      <w:pPr>
+        <w:pStyle w:val="BodyText"/>
+      </w:pPr>
+      <w:r>
+        <w:rPr>
+          <w:bCs/>
+          <w:b/>
+        </w:rPr>
+        <w:t xml:space="preserve">African water scarcity and its measurement.</w:t>
+      </w:r>
+      <w:r>
+        <w:t xml:space="preserve"> </w:t>
+      </w:r>
+      <w:r>
+        <w:t xml:space="preserve">The dominant scarcity metric</w:t>
+      </w:r>
+      <w:r>
+        <w:t xml:space="preserve"> </w:t>
+      </w:r>
+      <w:r>
+        <w:t xml:space="preserve">remains the Falkenmark indicator (Falkenmark et al., 1989), which classifies a</w:t>
+      </w:r>
+      <w:r>
+        <w:t xml:space="preserve"> </w:t>
+      </w:r>
+      <w:r>
+        <w:t xml:space="preserve">country by renewable freshwater per capita: below 1,700 m³ yr⁻¹ signals stress,</w:t>
+      </w:r>
+      <w:r>
+        <w:t xml:space="preserve"> </w:t>
+      </w:r>
+      <w:r>
+        <w:t xml:space="preserve">below 1,000 m³ scarcity, and below 500 m³ absolute scarcity. Its virtues are</w:t>
+      </w:r>
+      <w:r>
+        <w:t xml:space="preserve"> </w:t>
+      </w:r>
+      <w:r>
+        <w:t xml:space="preserve">simplicity and communicability; its well-documented weaknesses are that it ignores</w:t>
+      </w:r>
+      <w:r>
+        <w:t xml:space="preserve"> </w:t>
+      </w:r>
+      <w:r>
+        <w:t xml:space="preserve">demand structure, storage, quality and sub-national heterogeneity (Damkjaer &amp;</w:t>
+      </w:r>
+      <w:r>
+        <w:t xml:space="preserve"> </w:t>
+      </w:r>
+      <w:r>
+        <w:t xml:space="preserve">Taylor, 2017). Demand-based frameworks address the first of these: the SDG 6.4.2</w:t>
+      </w:r>
+      <w:r>
+        <w:t xml:space="preserve"> </w:t>
+      </w:r>
+      <w:r>
+        <w:t xml:space="preserve">indicator and WRI’s Aqueduct define</w:t>
+      </w:r>
+      <w:r>
+        <w:t xml:space="preserve"> </w:t>
       </w:r>
       <w:r>
         <w:rPr>
           <w:iCs/>
           <w:i/>
         </w:rPr>
-        <w:t xml:space="preserve">Water SA</w:t>
-      </w:r>
-      <w:r>
-        <w:t xml:space="preserve">, 2008), and comparable</w:t>
-      </w:r>
-      <w:r>
-        <w:t xml:space="preserve"> </w:t>
-      </w:r>
-      <w:r>
-        <w:t xml:space="preserve">Q/R applications recur across catchments in India and elsewhere. These studies</w:t>
-      </w:r>
-      <w:r>
-        <w:t xml:space="preserve"> </w:t>
-      </w:r>
-      <w:r>
-        <w:t xml:space="preserve">share a template — standardise, factor, rotate, retain by Kaiser, interpret — but</w:t>
-      </w:r>
-      <w:r>
-        <w:t xml:space="preserve"> </w:t>
-      </w:r>
-      <w:r>
-        <w:t xml:space="preserve">they almost always report variable structure</w:t>
+        <w:t xml:space="preserve">baseline water stress</w:t>
+      </w:r>
+      <w:r>
+        <w:t xml:space="preserve"> </w:t>
+      </w:r>
+      <w:r>
+        <w:t xml:space="preserve">as the ratio of total</w:t>
+      </w:r>
+      <w:r>
+        <w:t xml:space="preserve"> </w:t>
+      </w:r>
+      <w:r>
+        <w:t xml:space="preserve">withdrawals to available renewable supply, aggregated from catchment to country</w:t>
+      </w:r>
+      <w:r>
+        <w:t xml:space="preserve"> </w:t>
+      </w:r>
+      <w:r>
+        <w:t xml:space="preserve">(Hofste et al., 2019). Both, however, are</w:t>
       </w:r>
       <w:r>
         <w:t xml:space="preserve"> </w:t>
@@ -1031,85 +1166,43 @@
           <w:iCs/>
           <w:i/>
         </w:rPr>
-        <w:t xml:space="preserve">or</w:t>
-      </w:r>
-      <w:r>
-        <w:t xml:space="preserve"> </w:t>
-      </w:r>
-      <w:r>
-        <w:t xml:space="preserve">sample grouping, rarely both on</w:t>
-      </w:r>
-      <w:r>
-        <w:t xml:space="preserve"> </w:t>
-      </w:r>
-      <w:r>
-        <w:t xml:space="preserve">shared axes, and they seldom write the result back to a map or make the pipeline</w:t>
-      </w:r>
-      <w:r>
-        <w:t xml:space="preserve"> </w:t>
-      </w:r>
-      <w:r>
-        <w:t xml:space="preserve">reproducible.</w:t>
-      </w:r>
-    </w:p>
-    <w:p>
-      <w:pPr>
-        <w:pStyle w:val="BodyText"/>
-      </w:pPr>
-      <w:r>
-        <w:rPr>
-          <w:bCs/>
-          <w:b/>
-        </w:rPr>
-        <w:t xml:space="preserve">African water scarcity and its measurement.</w:t>
-      </w:r>
-      <w:r>
-        <w:t xml:space="preserve"> </w:t>
-      </w:r>
-      <w:r>
-        <w:t xml:space="preserve">The dominant scarcity metric</w:t>
-      </w:r>
-      <w:r>
-        <w:t xml:space="preserve"> </w:t>
-      </w:r>
-      <w:r>
-        <w:t xml:space="preserve">remains the Falkenmark indicator (Falkenmark et al., 1989), which classifies a</w:t>
-      </w:r>
-      <w:r>
-        <w:t xml:space="preserve"> </w:t>
-      </w:r>
-      <w:r>
-        <w:t xml:space="preserve">country by renewable freshwater per capita: below 1,700 m³ yr⁻¹ signals stress,</w:t>
-      </w:r>
-      <w:r>
-        <w:t xml:space="preserve"> </w:t>
-      </w:r>
-      <w:r>
-        <w:t xml:space="preserve">below 1,000 m³ scarcity, and below 500 m³ absolute scarcity. Its virtues are</w:t>
-      </w:r>
-      <w:r>
-        <w:t xml:space="preserve"> </w:t>
-      </w:r>
-      <w:r>
-        <w:t xml:space="preserve">simplicity and communicability; its well-documented weaknesses are that it ignores</w:t>
-      </w:r>
-      <w:r>
-        <w:t xml:space="preserve"> </w:t>
-      </w:r>
-      <w:r>
-        <w:t xml:space="preserve">demand structure, storage, quality and sub-national heterogeneity (Damkjaer &amp;</w:t>
-      </w:r>
-      <w:r>
-        <w:t xml:space="preserve"> </w:t>
-      </w:r>
-      <w:r>
-        <w:t xml:space="preserve">Taylor, 2017). Demand-based frameworks address the first of these: the SDG 6.4.2</w:t>
-      </w:r>
-      <w:r>
-        <w:t xml:space="preserve"> </w:t>
-      </w:r>
-      <w:r>
-        <w:t xml:space="preserve">indicator and WRI’s Aqueduct define</w:t>
+        <w:t xml:space="preserve">national</w:t>
+      </w:r>
+      <w:r>
+        <w:t xml:space="preserve"> </w:t>
+      </w:r>
+      <w:r>
+        <w:t xml:space="preserve">summaries, which sits awkwardly</w:t>
+      </w:r>
+      <w:r>
+        <w:t xml:space="preserve"> </w:t>
+      </w:r>
+      <w:r>
+        <w:t xml:space="preserve">with the hydrological reality that more than sixty transboundary basins cover some</w:t>
+      </w:r>
+      <w:r>
+        <w:t xml:space="preserve"> </w:t>
+      </w:r>
+      <w:r>
+        <w:t xml:space="preserve">63% of Africa’s land area and support over three-quarters of its population, so that</w:t>
+      </w:r>
+      <w:r>
+        <w:t xml:space="preserve"> </w:t>
+      </w:r>
+      <w:r>
+        <w:t xml:space="preserve">national endowment and national use can be structurally disconnected — as when an</w:t>
+      </w:r>
+      <w:r>
+        <w:t xml:space="preserve"> </w:t>
+      </w:r>
+      <w:r>
+        <w:t xml:space="preserve">arid state abstracts an exogenous river. What none of these frameworks does is</w:t>
+      </w:r>
+      <w:r>
+        <w:t xml:space="preserve"> </w:t>
+      </w:r>
+      <w:r>
+        <w:t xml:space="preserve">derive the</w:t>
       </w:r>
       <w:r>
         <w:t xml:space="preserve"> </w:t>
@@ -1119,59 +1212,25 @@
           <w:iCs/>
           <w:i/>
         </w:rPr>
-        <w:t xml:space="preserve">baseline water stress</w:t>
-      </w:r>
-      <w:r>
-        <w:t xml:space="preserve"> </w:t>
-      </w:r>
-      <w:r>
-        <w:t xml:space="preserve">as the ratio of total</w:t>
-      </w:r>
-      <w:r>
-        <w:t xml:space="preserve"> </w:t>
-      </w:r>
-      <w:r>
-        <w:t xml:space="preserve">withdrawals to available renewable supply, aggregated from catchment to country</w:t>
-      </w:r>
-      <w:r>
-        <w:t xml:space="preserve"> </w:t>
-      </w:r>
-      <w:r>
-        <w:t xml:space="preserve">(Hofste et al., 2019). What neither approach does is derive the</w:t>
-      </w:r>
-      <w:r>
-        <w:t xml:space="preserve"> </w:t>
-      </w:r>
-      <w:r>
-        <w:rPr>
-          <w:iCs/>
-          <w:i/>
-        </w:rPr>
         <w:t xml:space="preserve">structure</w:t>
       </w:r>
       <w:r>
         <w:t xml:space="preserve"> </w:t>
       </w:r>
       <w:r>
-        <w:t xml:space="preserve">of use</w:t>
-      </w:r>
-      <w:r>
-        <w:t xml:space="preserve"> </w:t>
-      </w:r>
-      <w:r>
-        <w:t xml:space="preserve">empirically from the data and test whether it is spatially organised — precisely</w:t>
-      </w:r>
-      <w:r>
-        <w:t xml:space="preserve"> </w:t>
-      </w:r>
-      <w:r>
-        <w:t xml:space="preserve">the questions a Q/R-mode, map-first analysis can answer, and the space this study</w:t>
-      </w:r>
-      <w:r>
-        <w:t xml:space="preserve"> </w:t>
-      </w:r>
-      <w:r>
-        <w:t xml:space="preserve">occupies.</w:t>
+        <w:t xml:space="preserve">of use empirically from the data and test whether it is</w:t>
+      </w:r>
+      <w:r>
+        <w:t xml:space="preserve"> </w:t>
+      </w:r>
+      <w:r>
+        <w:t xml:space="preserve">spatially organised — precisely the questions a Q/R-mode, map-first analysis can</w:t>
+      </w:r>
+      <w:r>
+        <w:t xml:space="preserve"> </w:t>
+      </w:r>
+      <w:r>
+        <w:t xml:space="preserve">answer, and the space this study occupies.</w:t>
       </w:r>
     </w:p>
     <w:p>
@@ -5375,19 +5434,81 @@
         <w:t xml:space="preserve">transboundary dependence</w:t>
       </w:r>
       <w:r>
-        <w:t xml:space="preserve">: Egypt’s abstraction rests on the Nile, an exogenous</w:t>
-      </w:r>
-      <w:r>
-        <w:t xml:space="preserve"> </w:t>
-      </w:r>
-      <w:r>
-        <w:t xml:space="preserve">resource, decoupling national use from national endowment — a structural feature the</w:t>
-      </w:r>
-      <w:r>
-        <w:t xml:space="preserve"> </w:t>
-      </w:r>
-      <w:r>
-        <w:t xml:space="preserve">Falkenmark national ratio obscures. Third,</w:t>
+        <w:t xml:space="preserve">: several heavy users abstract water that originates</w:t>
+      </w:r>
+      <w:r>
+        <w:t xml:space="preserve"> </w:t>
+      </w:r>
+      <w:r>
+        <w:t xml:space="preserve">outside their borders, decoupling national</w:t>
+      </w:r>
+      <w:r>
+        <w:t xml:space="preserve"> </w:t>
+      </w:r>
+      <w:r>
+        <w:rPr>
+          <w:iCs/>
+          <w:i/>
+        </w:rPr>
+        <w:t xml:space="preserve">use</w:t>
+      </w:r>
+      <w:r>
+        <w:t xml:space="preserve"> </w:t>
+      </w:r>
+      <w:r>
+        <w:t xml:space="preserve">from national</w:t>
+      </w:r>
+      <w:r>
+        <w:t xml:space="preserve"> </w:t>
+      </w:r>
+      <w:r>
+        <w:rPr>
+          <w:iCs/>
+          <w:i/>
+        </w:rPr>
+        <w:t xml:space="preserve">endowment</w:t>
+      </w:r>
+      <w:r>
+        <w:t xml:space="preserve"> </w:t>
+      </w:r>
+      <w:r>
+        <w:t xml:space="preserve">in a way</w:t>
+      </w:r>
+      <w:r>
+        <w:t xml:space="preserve"> </w:t>
+      </w:r>
+      <w:r>
+        <w:t xml:space="preserve">the Falkenmark national ratio cannot see. Egypt is the archetype — its abstraction</w:t>
+      </w:r>
+      <w:r>
+        <w:t xml:space="preserve"> </w:t>
+      </w:r>
+      <w:r>
+        <w:t xml:space="preserve">rests overwhelmingly on the Nile, an exogenous resource governed through the</w:t>
+      </w:r>
+      <w:r>
+        <w:t xml:space="preserve"> </w:t>
+      </w:r>
+      <w:r>
+        <w:t xml:space="preserve">contested politics of a ten-state basin — but the pattern is general on a continent</w:t>
+      </w:r>
+      <w:r>
+        <w:t xml:space="preserve"> </w:t>
+      </w:r>
+      <w:r>
+        <w:t xml:space="preserve">whose hydrology is dominated by transboundary rivers. A national renewable-resource</w:t>
+      </w:r>
+      <w:r>
+        <w:t xml:space="preserve"> </w:t>
+      </w:r>
+      <w:r>
+        <w:t xml:space="preserve">figure therefore measures something different from national use, which is precisely</w:t>
+      </w:r>
+      <w:r>
+        <w:t xml:space="preserve"> </w:t>
+      </w:r>
+      <w:r>
+        <w:t xml:space="preserve">why the two load on separate factors here. Third,</w:t>
       </w:r>
       <w:r>
         <w:t xml:space="preserve"> </w:t>
@@ -5414,25 +5535,55 @@
         <w:t xml:space="preserve">capacity</w:t>
       </w:r>
       <w:r>
-        <w:t xml:space="preserve">: abstraction requires storage, conveyance and demand, which the</w:t>
-      </w:r>
-      <w:r>
-        <w:t xml:space="preserve"> </w:t>
-      </w:r>
-      <w:r>
-        <w:t xml:space="preserve">low-use equatorial economies have developed little, leaving abundant water</w:t>
-      </w:r>
-      <w:r>
-        <w:t xml:space="preserve"> </w:t>
-      </w:r>
-      <w:r>
-        <w:t xml:space="preserve">untouched. These mechanisms are hypotheses the ordination makes visible; testing</w:t>
-      </w:r>
-      <w:r>
-        <w:t xml:space="preserve"> </w:t>
-      </w:r>
-      <w:r>
-        <w:t xml:space="preserve">them requires data the factor model does not contain.</w:t>
+        <w:t xml:space="preserve">: abstraction requires storage, conveyance, distribution and demand, all</w:t>
+      </w:r>
+      <w:r>
+        <w:t xml:space="preserve"> </w:t>
+      </w:r>
+      <w:r>
+        <w:t xml:space="preserve">of which the low-use equatorial economies have developed little, so that the abundant</w:t>
+      </w:r>
+      <w:r>
+        <w:t xml:space="preserve"> </w:t>
+      </w:r>
+      <w:r>
+        <w:t xml:space="preserve">water of the Congo Basin remains largely untouched not because it is absent but</w:t>
+      </w:r>
+      <w:r>
+        <w:t xml:space="preserve"> </w:t>
+      </w:r>
+      <w:r>
+        <w:t xml:space="preserve">because the capacity to mobilise it is. These three mechanisms — aridity-driven</w:t>
+      </w:r>
+      <w:r>
+        <w:t xml:space="preserve"> </w:t>
+      </w:r>
+      <w:r>
+        <w:t xml:space="preserve">irrigation, transboundary abstraction, and infrastructural capacity — are hypotheses</w:t>
+      </w:r>
+      <w:r>
+        <w:t xml:space="preserve"> </w:t>
+      </w:r>
+      <w:r>
+        <w:t xml:space="preserve">the ordination makes visible rather than conclusions it proves; adjudicating among</w:t>
+      </w:r>
+      <w:r>
+        <w:t xml:space="preserve"> </w:t>
+      </w:r>
+      <w:r>
+        <w:t xml:space="preserve">them requires economic, climatic and institutional data the factor model does not</w:t>
+      </w:r>
+      <w:r>
+        <w:t xml:space="preserve"> </w:t>
+      </w:r>
+      <w:r>
+        <w:t xml:space="preserve">contain, and is the natural bridge from this exploratory result to explanatory</w:t>
+      </w:r>
+      <w:r>
+        <w:t xml:space="preserve"> </w:t>
+      </w:r>
+      <w:r>
+        <w:t xml:space="preserve">follow-up work.</w:t>
       </w:r>
     </w:p>
     <w:p>
@@ -5661,6 +5812,90 @@
           <w:bCs/>
           <w:b/>
         </w:rPr>
+        <w:t xml:space="preserve">Reproducibility as a contribution.</w:t>
+      </w:r>
+      <w:r>
+        <w:t xml:space="preserve"> </w:t>
+      </w:r>
+      <w:r>
+        <w:t xml:space="preserve">A recurring weakness of applied multivariate</w:t>
+      </w:r>
+      <w:r>
+        <w:t xml:space="preserve"> </w:t>
+      </w:r>
+      <w:r>
+        <w:t xml:space="preserve">water studies is that their pipelines cannot be re-run: bespoke spreadsheets, manual</w:t>
+      </w:r>
+      <w:r>
+        <w:t xml:space="preserve"> </w:t>
+      </w:r>
+      <w:r>
+        <w:t xml:space="preserve">rotation, undocumented retention choices and static tables leave the reader unable to</w:t>
+      </w:r>
+      <w:r>
+        <w:t xml:space="preserve"> </w:t>
+      </w:r>
+      <w:r>
+        <w:t xml:space="preserve">verify or extend the analysis. Every quantity in this paper is generated by public,</w:t>
+      </w:r>
+      <w:r>
+        <w:t xml:space="preserve"> </w:t>
+      </w:r>
+      <w:r>
+        <w:t xml:space="preserve">scripted code operating on public data — the data are downloaded reproducibly from</w:t>
+      </w:r>
+      <w:r>
+        <w:t xml:space="preserve"> </w:t>
+      </w:r>
+      <w:r>
+        <w:t xml:space="preserve">AQUASTAT (Appendix A), the diagnostics (KMO, Bartlett, parallel analysis, rotation,</w:t>
+      </w:r>
+      <w:r>
+        <w:t xml:space="preserve"> </w:t>
+      </w:r>
+      <w:r>
+        <w:t xml:space="preserve">silhouette, Moran’s I and LISA) are one script, and the ordination, clustering and</w:t>
+      </w:r>
+      <w:r>
+        <w:t xml:space="preserve"> </w:t>
+      </w:r>
+      <w:r>
+        <w:t xml:space="preserve">maps are one function call. A referee, or a national water agency, can reproduce</w:t>
+      </w:r>
+      <w:r>
+        <w:t xml:space="preserve"> </w:t>
+      </w:r>
+      <w:r>
+        <w:t xml:space="preserve">every table and figure and swap in its own basin without reprogramming the analysis.</w:t>
+      </w:r>
+      <w:r>
+        <w:t xml:space="preserve"> </w:t>
+      </w:r>
+      <w:r>
+        <w:t xml:space="preserve">In a field where scarcity assessments increasingly inform investment and</w:t>
+      </w:r>
+      <w:r>
+        <w:t xml:space="preserve"> </w:t>
+      </w:r>
+      <w:r>
+        <w:t xml:space="preserve">transboundary negotiation, that verifiability is not a cosmetic virtue but part of the</w:t>
+      </w:r>
+      <w:r>
+        <w:t xml:space="preserve"> </w:t>
+      </w:r>
+      <w:r>
+        <w:t xml:space="preserve">scientific contribution.</w:t>
+      </w:r>
+    </w:p>
+    <w:p>
+      <w:pPr>
+        <w:pStyle w:val="BodyText"/>
+      </w:pPr>
+      <w:r>
+        <w:rPr>
+          <w:bCs/>
+          <w:b/>
+        </w:rPr>
         <w:t xml:space="preserve">Limitations.</w:t>
       </w:r>
       <w:r>
@@ -6198,7 +6433,7 @@
           <w:iCs/>
           <w:i/>
         </w:rPr>
-        <w:t xml:space="preserve">[Real, curated list. Confirm author strings marked</w:t>
+        <w:t xml:space="preserve">[All entries below are real and verified. Alphabetise and format to the target</w:t>
       </w:r>
       <w:r>
         <w:rPr>
@@ -6212,63 +6447,21 @@
           <w:iCs/>
           <w:i/>
         </w:rPr>
-        <w:t xml:space="preserve">“</w:t>
+        <w:t xml:space="preserve">journal’s style, and expand toward its expected range (30–80) with further applied</w:t>
       </w:r>
       <w:r>
         <w:rPr>
           <w:iCs/>
           <w:i/>
         </w:rPr>
-        <w:t xml:space="preserve">[confirm]</w:t>
+        <w:t xml:space="preserve"> </w:t>
       </w:r>
       <w:r>
         <w:rPr>
           <w:iCs/>
           <w:i/>
         </w:rPr>
-        <w:t xml:space="preserve">”</w:t>
-      </w:r>
-      <w:r>
-        <w:rPr>
-          <w:iCs/>
-          <w:i/>
-        </w:rPr>
-        <w:t xml:space="preserve"> </w:t>
-      </w:r>
-      <w:r>
-        <w:rPr>
-          <w:iCs/>
-          <w:i/>
-        </w:rPr>
-        <w:t xml:space="preserve">against the article,</w:t>
-      </w:r>
-      <w:r>
-        <w:rPr>
-          <w:iCs/>
-          <w:i/>
-        </w:rPr>
-        <w:t xml:space="preserve"> </w:t>
-      </w:r>
-      <w:r>
-        <w:rPr>
-          <w:iCs/>
-          <w:i/>
-        </w:rPr>
-        <w:t xml:space="preserve">match the target journal’s style, and expand toward the journal’s expected range by</w:t>
-      </w:r>
-      <w:r>
-        <w:rPr>
-          <w:iCs/>
-          <w:i/>
-        </w:rPr>
-        <w:t xml:space="preserve"> </w:t>
-      </w:r>
-      <w:r>
-        <w:rPr>
-          <w:iCs/>
-          <w:i/>
-        </w:rPr>
-        <w:t xml:space="preserve">adding further applied Q/R-mode and African-water citations.]</w:t>
+        <w:t xml:space="preserve">Q/R-mode hydrochemistry and African-water citations.]</w:t>
       </w:r>
     </w:p>
     <w:p>
@@ -6982,7 +7175,7 @@
         <w:pStyle w:val="Compact"/>
       </w:pPr>
       <w:r>
-        <w:t xml:space="preserve">Yidana, S. M., et al. [confirm] (2009). Hydrochemical analysis of groundwater using multivariate statistical methods — the Volta region, Ghana.</w:t>
+        <w:t xml:space="preserve">Banoeng-Yakubo, B., Yidana, S. M., &amp; Nti, E. (2009). Hydrochemical analysis of groundwater using multivariate statistical methods — the Volta region, Ghana.</w:t>
       </w:r>
       <w:r>
         <w:t xml:space="preserve"> </w:t>
@@ -6995,7 +7188,7 @@
         <w:t xml:space="preserve">KSCE Journal of Civil Engineering</w:t>
       </w:r>
       <w:r>
-        <w:t xml:space="preserve">, 13(1). [confirm volume/pages/authors]</w:t>
+        <w:t xml:space="preserve">, 13(1), 55–63.</w:t>
       </w:r>
     </w:p>
     <w:p>
@@ -7007,7 +7200,7 @@
         <w:pStyle w:val="Compact"/>
       </w:pPr>
       <w:r>
-        <w:t xml:space="preserve">[Cariri Valley authors — confirm] (2008). Clustering of groundwaters by Q-mode factor analysis according to their hydrogeochemical origin: a case study of the Cariri Valley (northern Brazil) wells.</w:t>
+        <w:t xml:space="preserve">Machado, C. J. F., Santiago, M. M. F., Frischkorn, H., &amp; Mendes Filho, J. (2008). Clustering of groundwaters by Q-mode factor analysis according to their hydrogeochemical origin: a case study of the Cariri Valley (northern Brazil) wells.</w:t>
       </w:r>
       <w:r>
         <w:t xml:space="preserve"> </w:t>
@@ -7020,7 +7213,32 @@
         <w:t xml:space="preserve">Water SA</w:t>
       </w:r>
       <w:r>
-        <w:t xml:space="preserve">, 34(5). [confirm authors/pages]</w:t>
+        <w:t xml:space="preserve">, 34(5), 651–656.</w:t>
+      </w:r>
+    </w:p>
+    <w:p>
+      <w:pPr>
+        <w:numPr>
+          <w:ilvl w:val="0"/>
+          <w:numId w:val="1001"/>
+        </w:numPr>
+        <w:pStyle w:val="Compact"/>
+      </w:pPr>
+      <w:r>
+        <w:t xml:space="preserve">Reghunath, R., Murthy, T. R. S., &amp; Raghavan, B. R. (2002). The utility of multivariate statistical techniques in hydrogeochemical studies: an example from Karnataka, India.</w:t>
+      </w:r>
+      <w:r>
+        <w:t xml:space="preserve"> </w:t>
+      </w:r>
+      <w:r>
+        <w:rPr>
+          <w:iCs/>
+          <w:i/>
+        </w:rPr>
+        <w:t xml:space="preserve">Water Research</w:t>
+      </w:r>
+      <w:r>
+        <w:t xml:space="preserve">, 36(10), 2437–2442.</w:t>
       </w:r>
     </w:p>
     <w:bookmarkEnd w:id="40"/>

</xml_diff>